<commit_message>
chore(template): update resume template
Co-Authored-By: Claude Opus 5.5 <noreply@anthropic.com>
</commit_message>
<xml_diff>
--- a/src/templates/ResumeTemplate_Tagged.docx
+++ b/src/templates/ResumeTemplate_Tagged.docx
@@ -64,9 +64,6 @@
           <w:p>
             <w:pPr>
               <w:pStyle w:val="Subtitle"/>
-              <w:pBdr>
-                <w:bottom w:val="single" w:sz="4" w:space="1" w:color="auto"/>
-              </w:pBdr>
               <w:rPr>
                 <w:rFonts w:ascii="Aptos" w:hAnsi="Aptos"/>
                 <w:sz w:val="24"/>
@@ -79,7 +76,6 @@
                 <w:rFonts w:ascii="Aptos" w:hAnsi="Aptos"/>
                 <w:sz w:val="24"/>
                 <w:szCs w:val="24"/>
-                <w:bdr w:val="single" w:sz="12" w:space="0" w:color="411E56" w:themeColor="accent6" w:themeShade="BF"/>
               </w:rPr>
               <w:t>{{ title</w:t>
             </w:r>
@@ -89,7 +85,6 @@
                 <w:rFonts w:ascii="Aptos" w:hAnsi="Aptos"/>
                 <w:sz w:val="24"/>
                 <w:szCs w:val="24"/>
-                <w:bdr w:val="single" w:sz="12" w:space="0" w:color="411E56" w:themeColor="accent6" w:themeShade="BF"/>
               </w:rPr>
               <w:t xml:space="preserve"> }}</w:t>
             </w:r>
@@ -974,9 +969,6 @@
     </w:p>
     <w:p>
       <w:pPr>
-        <w:pBdr>
-          <w:bottom w:val="single" w:sz="8" w:space="1" w:color="411E56" w:themeColor="accent6" w:themeShade="BF"/>
-        </w:pBdr>
         <w:tabs>
           <w:tab w:val="right" w:pos="10800"/>
         </w:tabs>

</xml_diff>

<commit_message>
fix(extraction): read two-column PDFs by column and drop placeholder institutions
Sidebar CVs were read line by line, interleaving the sidebar with the main
column, so the model paired designations and dates with the wrong employer
(Wipro shown with Atos's Automation Solution Architect role and dates).
Two-column pages are now detected by their gutter and read one column at a
time, with each column kept continuous across pages.

Education no longer renders 'Institution Name Not Provided': institution is
optional in the schema, placeholder values are blanked, and the template
omits the institution line when it is empty.

Co-Authored-By: Claude Opus 5.5 <noreply@anthropic.com>
</commit_message>
<xml_diff>
--- a/src/templates/ResumeTemplate_Tagged.docx
+++ b/src/templates/ResumeTemplate_Tagged.docx
@@ -508,6 +508,20 @@
                 <w:rFonts w:ascii="Aptos" w:hAnsi="Aptos"/>
               </w:rPr>
             </w:pPr>
+            <w:r>
+              <w:rPr>
+                <w:rFonts w:ascii="Aptos" w:hAnsi="Aptos"/>
+              </w:rPr>
+              <w:t>{%p if edu.institution_line %}</w:t>
+            </w:r>
+          </w:p>
+          <w:p>
+            <w:pPr>
+              <w:ind w:left="450"/>
+              <w:rPr>
+                <w:rFonts w:ascii="Aptos" w:hAnsi="Aptos"/>
+              </w:rPr>
+            </w:pPr>
             <w:proofErr w:type="gramStart"/>
             <w:r>
               <w:rPr>
@@ -535,6 +549,20 @@
                 <w:rFonts w:ascii="Aptos" w:hAnsi="Aptos"/>
               </w:rPr>
               <w:t>}</w:t>
+            </w:r>
+          </w:p>
+          <w:p>
+            <w:pPr>
+              <w:ind w:left="450"/>
+              <w:rPr>
+                <w:rFonts w:ascii="Aptos" w:hAnsi="Aptos"/>
+              </w:rPr>
+            </w:pPr>
+            <w:r>
+              <w:rPr>
+                <w:rFonts w:ascii="Aptos" w:hAnsi="Aptos"/>
+              </w:rPr>
+              <w:t>{%p endif %}</w:t>
             </w:r>
           </w:p>
           <w:p>

</xml_diff>